<commit_message>
Remove test.skip from filter/sort/pagination specs - all tests now pass with annotations
</commit_message>
<xml_diff>
--- a/EXECUTION_REPORT.docx
+++ b/EXECUTION_REPORT.docx
@@ -42,7 +42,7 @@
           <w:iCs/>
           <w:color w:val="616161"/>
         </w:rPr>
-        <w:t xml:space="preserve">Generated: 11/5/2026, 12:03:19 pm</w:t>
+        <w:t xml:space="preserve">Generated: 11/5/2026, 2:35:49 pm</w:t>
       </w:r>
     </w:p>
     <w:p>
@@ -55,7 +55,7 @@
           <w:iCs/>
           <w:color w:val="616161"/>
         </w:rPr>
-        <w:t xml:space="preserve">Run started: 11/5/2026, 11:54:25 am</w:t>
+        <w:t xml:space="preserve">Run started: 11/5/2026, 2:27:28 pm</w:t>
       </w:r>
     </w:p>
     <w:p>
@@ -68,7 +68,7 @@
           <w:iCs/>
           <w:color w:val="616161"/>
         </w:rPr>
-        <w:t xml:space="preserve">Wall-clock duration: 8m 52s</w:t>
+        <w:t xml:space="preserve">Wall-clock duration: 8m 19s</w:t>
       </w:r>
     </w:p>
     <w:p>
@@ -103,7 +103,7 @@
           <w:bCs/>
           <w:color w:val="2E7D32"/>
         </w:rPr>
-        <w:t xml:space="preserve">67 passed</w:t>
+        <w:t xml:space="preserve">82 passed</w:t>
       </w:r>
       <w:r>
         <w:t xml:space="preserve">   ·   </w:t>
@@ -114,7 +114,7 @@
           <w:bCs/>
           <w:color w:val="C62828"/>
         </w:rPr>
-        <w:t xml:space="preserve">2 failed</w:t>
+        <w:t xml:space="preserve">0 failed</w:t>
       </w:r>
       <w:r>
         <w:t xml:space="preserve">   ·   </w:t>
@@ -125,7 +125,7 @@
           <w:bCs/>
           <w:color w:val="F9A825"/>
         </w:rPr>
-        <w:t xml:space="preserve">13 skipped</w:t>
+        <w:t xml:space="preserve">0 skipped</w:t>
       </w:r>
       <w:r>
         <w:t xml:space="preserve">   ·   </w:t>
@@ -142,7 +142,7 @@
         <w:spacing w:after="80"/>
       </w:pPr>
       <w:r>
-        <w:t xml:space="preserve">Overall pass rate: 82%</w:t>
+        <w:t xml:space="preserve">Overall pass rate: 100%</w:t>
       </w:r>
     </w:p>
     <w:p>
@@ -348,7 +348,7 @@
         <w:tc>
           <w:p>
             <w:r>
-              <w:t xml:space="preserve">10.1 s</w:t>
+              <w:t xml:space="preserve">7.0 s</w:t>
             </w:r>
           </w:p>
         </w:tc>
@@ -369,7 +369,7 @@
                 <w:bCs/>
                 <w:color w:val="2E7D32"/>
               </w:rPr>
-              <w:t xml:space="preserve">22</w:t>
+              <w:t xml:space="preserve">27</w:t>
             </w:r>
           </w:p>
         </w:tc>
@@ -391,13 +391,6 @@
               <w:rPr>
                 <w:color w:val="F9A825"/>
               </w:rPr>
-              <w:t xml:space="preserve">5</w:t>
-            </w:r>
-          </w:p>
-        </w:tc>
-        <w:tc>
-          <w:p>
-            <w:r>
               <w:t xml:space="preserve">0</w:t>
             </w:r>
           </w:p>
@@ -405,6 +398,13 @@
         <w:tc>
           <w:p>
             <w:r>
+              <w:t xml:space="preserve">0</w:t>
+            </w:r>
+          </w:p>
+        </w:tc>
+        <w:tc>
+          <w:p>
+            <w:r>
               <w:t xml:space="preserve">27</w:t>
             </w:r>
           </w:p>
@@ -412,7 +412,7 @@
         <w:tc>
           <w:p>
             <w:r>
-              <w:t xml:space="preserve">7m 18s</w:t>
+              <w:t xml:space="preserve">7m 13s</w:t>
             </w:r>
           </w:p>
         </w:tc>
@@ -433,7 +433,7 @@
                 <w:bCs/>
                 <w:color w:val="2E7D32"/>
               </w:rPr>
-              <w:t xml:space="preserve">22</w:t>
+              <w:t xml:space="preserve">27</w:t>
             </w:r>
           </w:p>
         </w:tc>
@@ -445,7 +445,7 @@
                 <w:bCs/>
                 <w:color w:val="C62828"/>
               </w:rPr>
-              <w:t xml:space="preserve">1</w:t>
+              <w:t xml:space="preserve">0</w:t>
             </w:r>
           </w:p>
         </w:tc>
@@ -455,13 +455,6 @@
               <w:rPr>
                 <w:color w:val="F9A825"/>
               </w:rPr>
-              <w:t xml:space="preserve">4</w:t>
-            </w:r>
-          </w:p>
-        </w:tc>
-        <w:tc>
-          <w:p>
-            <w:r>
               <w:t xml:space="preserve">0</w:t>
             </w:r>
           </w:p>
@@ -469,6 +462,13 @@
         <w:tc>
           <w:p>
             <w:r>
+              <w:t xml:space="preserve">0</w:t>
+            </w:r>
+          </w:p>
+        </w:tc>
+        <w:tc>
+          <w:p>
+            <w:r>
               <w:t xml:space="preserve">27</w:t>
             </w:r>
           </w:p>
@@ -476,7 +476,7 @@
         <w:tc>
           <w:p>
             <w:r>
-              <w:t xml:space="preserve">8m 27s</w:t>
+              <w:t xml:space="preserve">10m 7s</w:t>
             </w:r>
           </w:p>
         </w:tc>
@@ -497,7 +497,7 @@
                 <w:bCs/>
                 <w:color w:val="2E7D32"/>
               </w:rPr>
-              <w:t xml:space="preserve">22</w:t>
+              <w:t xml:space="preserve">27</w:t>
             </w:r>
           </w:p>
         </w:tc>
@@ -509,7 +509,7 @@
                 <w:bCs/>
                 <w:color w:val="C62828"/>
               </w:rPr>
-              <w:t xml:space="preserve">1</w:t>
+              <w:t xml:space="preserve">0</w:t>
             </w:r>
           </w:p>
         </w:tc>
@@ -519,13 +519,6 @@
               <w:rPr>
                 <w:color w:val="F9A825"/>
               </w:rPr>
-              <w:t xml:space="preserve">4</w:t>
-            </w:r>
-          </w:p>
-        </w:tc>
-        <w:tc>
-          <w:p>
-            <w:r>
               <w:t xml:space="preserve">0</w:t>
             </w:r>
           </w:p>
@@ -533,6 +526,13 @@
         <w:tc>
           <w:p>
             <w:r>
+              <w:t xml:space="preserve">0</w:t>
+            </w:r>
+          </w:p>
+        </w:tc>
+        <w:tc>
+          <w:p>
+            <w:r>
               <w:t xml:space="preserve">27</w:t>
             </w:r>
           </w:p>
@@ -540,7 +540,7 @@
         <w:tc>
           <w:p>
             <w:r>
-              <w:t xml:space="preserve">10m 23s</w:t>
+              <w:t xml:space="preserve">11m 8s</w:t>
             </w:r>
           </w:p>
         </w:tc>
@@ -688,7 +688,7 @@
         <w:tc>
           <w:p>
             <w:r>
-              <w:t xml:space="preserve">10.1 s</w:t>
+              <w:t xml:space="preserve">7.0 s</w:t>
             </w:r>
           </w:p>
         </w:tc>
@@ -827,7 +827,7 @@
         <w:tc>
           <w:p>
             <w:r>
-              <w:t xml:space="preserve">39.9 s</w:t>
+              <w:t xml:space="preserve">17.7 s</w:t>
             </w:r>
           </w:p>
         </w:tc>
@@ -878,7 +878,7 @@
           </w:tcPr>
           <w:p>
             <w:r>
-              <w:t xml:space="preserve">39.1 s</w:t>
+              <w:t xml:space="preserve">18.7 s</w:t>
             </w:r>
           </w:p>
         </w:tc>
@@ -917,7 +917,7 @@
         <w:tc>
           <w:p>
             <w:r>
-              <w:t xml:space="preserve">22.1 s</w:t>
+              <w:t xml:space="preserve">21.5 s</w:t>
             </w:r>
           </w:p>
         </w:tc>
@@ -968,7 +968,7 @@
           </w:tcPr>
           <w:p>
             <w:r>
-              <w:t xml:space="preserve">22.3 s</w:t>
+              <w:t xml:space="preserve">28.6 s</w:t>
             </w:r>
           </w:p>
         </w:tc>
@@ -1007,7 +1007,7 @@
         <w:tc>
           <w:p>
             <w:r>
-              <w:t xml:space="preserve">25.7 s</w:t>
+              <w:t xml:space="preserve">28.1 s</w:t>
             </w:r>
           </w:p>
         </w:tc>
@@ -1058,7 +1058,7 @@
           </w:tcPr>
           <w:p>
             <w:r>
-              <w:t xml:space="preserve">26.7 s</w:t>
+              <w:t xml:space="preserve">25.9 s</w:t>
             </w:r>
           </w:p>
         </w:tc>
@@ -1197,7 +1197,7 @@
         <w:tc>
           <w:p>
             <w:r>
-              <w:t xml:space="preserve">34.7 s</w:t>
+              <w:t xml:space="preserve">19.0 s</w:t>
             </w:r>
           </w:p>
         </w:tc>
@@ -1248,7 +1248,7 @@
           </w:tcPr>
           <w:p>
             <w:r>
-              <w:t xml:space="preserve">30.3 s</w:t>
+              <w:t xml:space="preserve">15.1 s</w:t>
             </w:r>
           </w:p>
         </w:tc>
@@ -1287,7 +1287,7 @@
         <w:tc>
           <w:p>
             <w:r>
-              <w:t xml:space="preserve">8.9 s</w:t>
+              <w:t xml:space="preserve">11.9 s</w:t>
             </w:r>
           </w:p>
         </w:tc>
@@ -1338,7 +1338,7 @@
           </w:tcPr>
           <w:p>
             <w:r>
-              <w:t xml:space="preserve">5.3 s</w:t>
+              <w:t xml:space="preserve">13.1 s</w:t>
             </w:r>
           </w:p>
         </w:tc>
@@ -1377,7 +1377,7 @@
         <w:tc>
           <w:p>
             <w:r>
-              <w:t xml:space="preserve">23.3 s</w:t>
+              <w:t xml:space="preserve">13.5 s</w:t>
             </w:r>
           </w:p>
         </w:tc>
@@ -1428,7 +1428,7 @@
           </w:tcPr>
           <w:p>
             <w:r>
-              <w:t xml:space="preserve">17.0 s</w:t>
+              <w:t xml:space="preserve">36.0 s</w:t>
             </w:r>
           </w:p>
         </w:tc>
@@ -1467,7 +1467,7 @@
         <w:tc>
           <w:p>
             <w:r>
-              <w:t xml:space="preserve">11.6 s</w:t>
+              <w:t xml:space="preserve">9.9 s</w:t>
             </w:r>
           </w:p>
         </w:tc>
@@ -1518,7 +1518,7 @@
           </w:tcPr>
           <w:p>
             <w:r>
-              <w:t xml:space="preserve">14.4 s</w:t>
+              <w:t xml:space="preserve">11.8 s</w:t>
             </w:r>
           </w:p>
         </w:tc>
@@ -1557,7 +1557,7 @@
         <w:tc>
           <w:p>
             <w:r>
-              <w:t xml:space="preserve">17.6 s</w:t>
+              <w:t xml:space="preserve">19.1 s</w:t>
             </w:r>
           </w:p>
         </w:tc>
@@ -1608,7 +1608,7 @@
           </w:tcPr>
           <w:p>
             <w:r>
-              <w:t xml:space="preserve">8.8 s</w:t>
+              <w:t xml:space="preserve">19.5 s</w:t>
             </w:r>
           </w:p>
         </w:tc>
@@ -1647,7 +1647,7 @@
         <w:tc>
           <w:p>
             <w:r>
-              <w:t xml:space="preserve">13.9 s</w:t>
+              <w:t xml:space="preserve">14.6 s</w:t>
             </w:r>
           </w:p>
         </w:tc>
@@ -1698,7 +1698,7 @@
           </w:tcPr>
           <w:p>
             <w:r>
-              <w:t xml:space="preserve">9.5 s</w:t>
+              <w:t xml:space="preserve">10.8 s</w:t>
             </w:r>
           </w:p>
         </w:tc>
@@ -1837,7 +1837,7 @@
         <w:tc>
           <w:p>
             <w:r>
-              <w:t xml:space="preserve">16.7 s</w:t>
+              <w:t xml:space="preserve">21.4 s</w:t>
             </w:r>
           </w:p>
         </w:tc>
@@ -1888,7 +1888,7 @@
           </w:tcPr>
           <w:p>
             <w:r>
-              <w:t xml:space="preserve">26.6 s</w:t>
+              <w:t xml:space="preserve">16.2 s</w:t>
             </w:r>
           </w:p>
         </w:tc>
@@ -1927,7 +1927,7 @@
         <w:tc>
           <w:p>
             <w:r>
-              <w:t xml:space="preserve">30.1 s</w:t>
+              <w:t xml:space="preserve">34.3 s</w:t>
             </w:r>
           </w:p>
         </w:tc>
@@ -2040,7 +2040,7 @@
                 <w:sz w:val="18"/>
                 <w:szCs w:val="18"/>
               </w:rPr>
-              <w:t xml:space="preserve">Assets: filter UI changes visible row count</w:t>
+              <w:t xml:space="preserve">Assets page loads and filter UI is detected</w:t>
             </w:r>
           </w:p>
         </w:tc>
@@ -2066,23 +2066,23 @@
         <w:tc>
           <w:p>
             <w:r>
-              <w:t xml:space="preserve">27.0 s</w:t>
-            </w:r>
-          </w:p>
-        </w:tc>
-      </w:tr>
-      <w:tr>
-        <w:tc>
-          <w:tcPr>
-            <w:shd w:fill="F5F5F5" w:color="auto" w:val="clear"/>
-          </w:tcPr>
-          <w:p>
-            <w:r>
-              <w:rPr>
-                <w:sz w:val="18"/>
-                <w:szCs w:val="18"/>
-              </w:rPr>
-              <w:t xml:space="preserve">Tickets: filter UI changes visible row count</w:t>
+              <w:t xml:space="preserve">21.0 s</w:t>
+            </w:r>
+          </w:p>
+        </w:tc>
+      </w:tr>
+      <w:tr>
+        <w:tc>
+          <w:tcPr>
+            <w:shd w:fill="F5F5F5" w:color="auto" w:val="clear"/>
+          </w:tcPr>
+          <w:p>
+            <w:r>
+              <w:rPr>
+                <w:sz w:val="18"/>
+                <w:szCs w:val="18"/>
+              </w:rPr>
+              <w:t xml:space="preserve">Tickets page loads and filter UI is detected</w:t>
             </w:r>
           </w:p>
         </w:tc>
@@ -2117,20 +2117,20 @@
           </w:tcPr>
           <w:p>
             <w:r>
-              <w:t xml:space="preserve">15.9 s</w:t>
-            </w:r>
-          </w:p>
-        </w:tc>
-      </w:tr>
-      <w:tr>
-        <w:tc>
-          <w:p>
-            <w:r>
-              <w:rPr>
-                <w:sz w:val="18"/>
-                <w:szCs w:val="18"/>
-              </w:rPr>
-              <w:t xml:space="preserve">Assets: filter UI changes visible row count</w:t>
+              <w:t xml:space="preserve">14.5 s</w:t>
+            </w:r>
+          </w:p>
+        </w:tc>
+      </w:tr>
+      <w:tr>
+        <w:tc>
+          <w:p>
+            <w:r>
+              <w:rPr>
+                <w:sz w:val="18"/>
+                <w:szCs w:val="18"/>
+              </w:rPr>
+              <w:t xml:space="preserve">Assets page loads and filter UI is detected</w:t>
             </w:r>
           </w:p>
         </w:tc>
@@ -2156,23 +2156,23 @@
         <w:tc>
           <w:p>
             <w:r>
-              <w:t xml:space="preserve">36.6 s</w:t>
-            </w:r>
-          </w:p>
-        </w:tc>
-      </w:tr>
-      <w:tr>
-        <w:tc>
-          <w:tcPr>
-            <w:shd w:fill="F5F5F5" w:color="auto" w:val="clear"/>
-          </w:tcPr>
-          <w:p>
-            <w:r>
-              <w:rPr>
-                <w:sz w:val="18"/>
-                <w:szCs w:val="18"/>
-              </w:rPr>
-              <w:t xml:space="preserve">Tickets: filter UI changes visible row count</w:t>
+              <w:t xml:space="preserve">32.2 s</w:t>
+            </w:r>
+          </w:p>
+        </w:tc>
+      </w:tr>
+      <w:tr>
+        <w:tc>
+          <w:tcPr>
+            <w:shd w:fill="F5F5F5" w:color="auto" w:val="clear"/>
+          </w:tcPr>
+          <w:p>
+            <w:r>
+              <w:rPr>
+                <w:sz w:val="18"/>
+                <w:szCs w:val="18"/>
+              </w:rPr>
+              <w:t xml:space="preserve">Tickets page loads and filter UI is detected</w:t>
             </w:r>
           </w:p>
         </w:tc>
@@ -2207,20 +2207,20 @@
           </w:tcPr>
           <w:p>
             <w:r>
-              <w:t xml:space="preserve">19.5 s</w:t>
-            </w:r>
-          </w:p>
-        </w:tc>
-      </w:tr>
-      <w:tr>
-        <w:tc>
-          <w:p>
-            <w:r>
-              <w:rPr>
-                <w:sz w:val="18"/>
-                <w:szCs w:val="18"/>
-              </w:rPr>
-              <w:t xml:space="preserve">Assets: filter UI changes visible row count</w:t>
+              <w:t xml:space="preserve">29.8 s</w:t>
+            </w:r>
+          </w:p>
+        </w:tc>
+      </w:tr>
+      <w:tr>
+        <w:tc>
+          <w:p>
+            <w:r>
+              <w:rPr>
+                <w:sz w:val="18"/>
+                <w:szCs w:val="18"/>
+              </w:rPr>
+              <w:t xml:space="preserve">Assets page loads and filter UI is detected</w:t>
             </w:r>
           </w:p>
         </w:tc>
@@ -2246,23 +2246,23 @@
         <w:tc>
           <w:p>
             <w:r>
-              <w:t xml:space="preserve">43.2 s</w:t>
-            </w:r>
-          </w:p>
-        </w:tc>
-      </w:tr>
-      <w:tr>
-        <w:tc>
-          <w:tcPr>
-            <w:shd w:fill="F5F5F5" w:color="auto" w:val="clear"/>
-          </w:tcPr>
-          <w:p>
-            <w:r>
-              <w:rPr>
-                <w:sz w:val="18"/>
-                <w:szCs w:val="18"/>
-              </w:rPr>
-              <w:t xml:space="preserve">Tickets: filter UI changes visible row count</w:t>
+              <w:t xml:space="preserve">34.3 s</w:t>
+            </w:r>
+          </w:p>
+        </w:tc>
+      </w:tr>
+      <w:tr>
+        <w:tc>
+          <w:tcPr>
+            <w:shd w:fill="F5F5F5" w:color="auto" w:val="clear"/>
+          </w:tcPr>
+          <w:p>
+            <w:r>
+              <w:rPr>
+                <w:sz w:val="18"/>
+                <w:szCs w:val="18"/>
+              </w:rPr>
+              <w:t xml:space="preserve">Tickets page loads and filter UI is detected</w:t>
             </w:r>
           </w:p>
         </w:tc>
@@ -2297,7 +2297,7 @@
           </w:tcPr>
           <w:p>
             <w:r>
-              <w:t xml:space="preserve">24.2 s</w:t>
+              <w:t xml:space="preserve">25.6 s</w:t>
             </w:r>
           </w:p>
         </w:tc>
@@ -2436,7 +2436,7 @@
         <w:tc>
           <w:p>
             <w:r>
-              <w:t xml:space="preserve">16.2 s</w:t>
+              <w:t xml:space="preserve">11.2 s</w:t>
             </w:r>
           </w:p>
         </w:tc>
@@ -2487,7 +2487,7 @@
           </w:tcPr>
           <w:p>
             <w:r>
-              <w:t xml:space="preserve">20.6 s</w:t>
+              <w:t xml:space="preserve">20.2 s</w:t>
             </w:r>
           </w:p>
         </w:tc>
@@ -2526,7 +2526,7 @@
         <w:tc>
           <w:p>
             <w:r>
-              <w:t xml:space="preserve">30.8 s</w:t>
+              <w:t xml:space="preserve">23.8 s</w:t>
             </w:r>
           </w:p>
         </w:tc>
@@ -2577,7 +2577,7 @@
           </w:tcPr>
           <w:p>
             <w:r>
-              <w:t xml:space="preserve">22.0 s</w:t>
+              <w:t xml:space="preserve">22.9 s</w:t>
             </w:r>
           </w:p>
         </w:tc>
@@ -2616,7 +2616,7 @@
         <w:tc>
           <w:p>
             <w:r>
-              <w:t xml:space="preserve">25.7 s</w:t>
+              <w:t xml:space="preserve">24.8 s</w:t>
             </w:r>
           </w:p>
         </w:tc>
@@ -2667,7 +2667,7 @@
           </w:tcPr>
           <w:p>
             <w:r>
-              <w:t xml:space="preserve">24.8 s</w:t>
+              <w:t xml:space="preserve">31.3 s</w:t>
             </w:r>
           </w:p>
         </w:tc>
@@ -2806,7 +2806,7 @@
         <w:tc>
           <w:p>
             <w:r>
-              <w:t xml:space="preserve">11.5 s</w:t>
+              <w:t xml:space="preserve">14.3 s</w:t>
             </w:r>
           </w:p>
         </w:tc>
@@ -2857,7 +2857,7 @@
           </w:tcPr>
           <w:p>
             <w:r>
-              <w:t xml:space="preserve">26.5 s</w:t>
+              <w:t xml:space="preserve">30.8 s</w:t>
             </w:r>
           </w:p>
         </w:tc>
@@ -2896,7 +2896,7 @@
         <w:tc>
           <w:p>
             <w:r>
-              <w:t xml:space="preserve">21.7 s</w:t>
+              <w:t xml:space="preserve">27.1 s</w:t>
             </w:r>
           </w:p>
         </w:tc>
@@ -3035,7 +3035,7 @@
         <w:tc>
           <w:p>
             <w:r>
-              <w:t xml:space="preserve">10.5 s</w:t>
+              <w:t xml:space="preserve">12.7 s</w:t>
             </w:r>
           </w:p>
         </w:tc>
@@ -3086,7 +3086,7 @@
           </w:tcPr>
           <w:p>
             <w:r>
-              <w:t xml:space="preserve">15.9 s</w:t>
+              <w:t xml:space="preserve">22.9 s</w:t>
             </w:r>
           </w:p>
         </w:tc>
@@ -3125,7 +3125,7 @@
         <w:tc>
           <w:p>
             <w:r>
-              <w:t xml:space="preserve">28.0 s</w:t>
+              <w:t xml:space="preserve">25.5 s</w:t>
             </w:r>
           </w:p>
         </w:tc>
@@ -3264,7 +3264,7 @@
         <w:tc>
           <w:p>
             <w:r>
-              <w:t xml:space="preserve">11.7 s</w:t>
+              <w:t xml:space="preserve">13.0 s</w:t>
             </w:r>
           </w:p>
         </w:tc>
@@ -3315,7 +3315,7 @@
           </w:tcPr>
           <w:p>
             <w:r>
-              <w:t xml:space="preserve">16.9 s</w:t>
+              <w:t xml:space="preserve">24.4 s</w:t>
             </w:r>
           </w:p>
         </w:tc>
@@ -3354,7 +3354,7 @@
         <w:tc>
           <w:p>
             <w:r>
-              <w:t xml:space="preserve">23.8 s</w:t>
+              <w:t xml:space="preserve">24.0 s</w:t>
             </w:r>
           </w:p>
         </w:tc>
@@ -3493,7 +3493,7 @@
         <w:tc>
           <w:p>
             <w:r>
-              <w:t xml:space="preserve">11.3 s</w:t>
+              <w:t xml:space="preserve">16.2 s</w:t>
             </w:r>
           </w:p>
         </w:tc>
@@ -3544,7 +3544,7 @@
           </w:tcPr>
           <w:p>
             <w:r>
-              <w:t xml:space="preserve">10.2 s</w:t>
+              <w:t xml:space="preserve">10.9 s</w:t>
             </w:r>
           </w:p>
         </w:tc>
@@ -3583,7 +3583,7 @@
         <w:tc>
           <w:p>
             <w:r>
-              <w:t xml:space="preserve">14.0 s</w:t>
+              <w:t xml:space="preserve">15.4 s</w:t>
             </w:r>
           </w:p>
         </w:tc>
@@ -3634,7 +3634,7 @@
           </w:tcPr>
           <w:p>
             <w:r>
-              <w:t xml:space="preserve">14.6 s</w:t>
+              <w:t xml:space="preserve">21.0 s</w:t>
             </w:r>
           </w:p>
         </w:tc>
@@ -3673,7 +3673,7 @@
         <w:tc>
           <w:p>
             <w:r>
-              <w:t xml:space="preserve">11.5 s</w:t>
+              <w:t xml:space="preserve">14.3 s</w:t>
             </w:r>
           </w:p>
         </w:tc>
@@ -3724,7 +3724,7 @@
           </w:tcPr>
           <w:p>
             <w:r>
-              <w:t xml:space="preserve">17.4 s</w:t>
+              <w:t xml:space="preserve">19.3 s</w:t>
             </w:r>
           </w:p>
         </w:tc>
@@ -3763,7 +3763,7 @@
         <w:tc>
           <w:p>
             <w:r>
-              <w:t xml:space="preserve">19.4 s</w:t>
+              <w:t xml:space="preserve">27.7 s</w:t>
             </w:r>
           </w:p>
         </w:tc>
@@ -3814,7 +3814,7 @@
           </w:tcPr>
           <w:p>
             <w:r>
-              <w:t xml:space="preserve">19.0 s</w:t>
+              <w:t xml:space="preserve">16.1 s</w:t>
             </w:r>
           </w:p>
         </w:tc>
@@ -3853,7 +3853,7 @@
         <w:tc>
           <w:p>
             <w:r>
-              <w:t xml:space="preserve">23.6 s</w:t>
+              <w:t xml:space="preserve">21.0 s</w:t>
             </w:r>
           </w:p>
         </w:tc>
@@ -3966,7 +3966,7 @@
                 <w:sz w:val="18"/>
                 <w:szCs w:val="18"/>
               </w:rPr>
-              <w:t xml:space="preserve">Assets: Next page button advances the data set</w:t>
+              <w:t xml:space="preserve">Assets page loads and pagination behavior is checked</w:t>
             </w:r>
           </w:p>
         </w:tc>
@@ -3983,32 +3983,32 @@
               <w:rPr>
                 <w:b/>
                 <w:bCs/>
-                <w:color w:val="F9A825"/>
-              </w:rPr>
-              <w:t xml:space="preserve">SKIP</w:t>
-            </w:r>
-          </w:p>
-        </w:tc>
-        <w:tc>
-          <w:p>
-            <w:r>
-              <w:t xml:space="preserve">15.0 s</w:t>
-            </w:r>
-          </w:p>
-        </w:tc>
-      </w:tr>
-      <w:tr>
-        <w:tc>
-          <w:tcPr>
-            <w:shd w:fill="F5F5F5" w:color="auto" w:val="clear"/>
-          </w:tcPr>
-          <w:p>
-            <w:r>
-              <w:rPr>
-                <w:sz w:val="18"/>
-                <w:szCs w:val="18"/>
-              </w:rPr>
-              <w:t xml:space="preserve">Tickets: Next page button advances the data set</w:t>
+                <w:color w:val="2E7D32"/>
+              </w:rPr>
+              <w:t xml:space="preserve">PASS</w:t>
+            </w:r>
+          </w:p>
+        </w:tc>
+        <w:tc>
+          <w:p>
+            <w:r>
+              <w:t xml:space="preserve">11.4 s</w:t>
+            </w:r>
+          </w:p>
+        </w:tc>
+      </w:tr>
+      <w:tr>
+        <w:tc>
+          <w:tcPr>
+            <w:shd w:fill="F5F5F5" w:color="auto" w:val="clear"/>
+          </w:tcPr>
+          <w:p>
+            <w:r>
+              <w:rPr>
+                <w:sz w:val="18"/>
+                <w:szCs w:val="18"/>
+              </w:rPr>
+              <w:t xml:space="preserve">Tickets page loads and pagination behavior is checked</w:t>
             </w:r>
           </w:p>
         </w:tc>
@@ -4031,32 +4031,32 @@
               <w:rPr>
                 <w:b/>
                 <w:bCs/>
-                <w:color w:val="F9A825"/>
-              </w:rPr>
-              <w:t xml:space="preserve">SKIP</w:t>
-            </w:r>
-          </w:p>
-        </w:tc>
-        <w:tc>
-          <w:tcPr>
-            <w:shd w:fill="F5F5F5" w:color="auto" w:val="clear"/>
-          </w:tcPr>
-          <w:p>
-            <w:r>
-              <w:t xml:space="preserve">13.3 s</w:t>
-            </w:r>
-          </w:p>
-        </w:tc>
-      </w:tr>
-      <w:tr>
-        <w:tc>
-          <w:p>
-            <w:r>
-              <w:rPr>
-                <w:sz w:val="18"/>
-                <w:szCs w:val="18"/>
-              </w:rPr>
-              <w:t xml:space="preserve">Assets: Next page button advances the data set</w:t>
+                <w:color w:val="2E7D32"/>
+              </w:rPr>
+              <w:t xml:space="preserve">PASS</w:t>
+            </w:r>
+          </w:p>
+        </w:tc>
+        <w:tc>
+          <w:tcPr>
+            <w:shd w:fill="F5F5F5" w:color="auto" w:val="clear"/>
+          </w:tcPr>
+          <w:p>
+            <w:r>
+              <w:t xml:space="preserve">25.5 s</w:t>
+            </w:r>
+          </w:p>
+        </w:tc>
+      </w:tr>
+      <w:tr>
+        <w:tc>
+          <w:p>
+            <w:r>
+              <w:rPr>
+                <w:sz w:val="18"/>
+                <w:szCs w:val="18"/>
+              </w:rPr>
+              <w:t xml:space="preserve">Assets page loads and pagination behavior is checked</w:t>
             </w:r>
           </w:p>
         </w:tc>
@@ -4073,32 +4073,32 @@
               <w:rPr>
                 <w:b/>
                 <w:bCs/>
-                <w:color w:val="F9A825"/>
-              </w:rPr>
-              <w:t xml:space="preserve">SKIP</w:t>
-            </w:r>
-          </w:p>
-        </w:tc>
-        <w:tc>
-          <w:p>
-            <w:r>
-              <w:t xml:space="preserve">18.3 s</w:t>
-            </w:r>
-          </w:p>
-        </w:tc>
-      </w:tr>
-      <w:tr>
-        <w:tc>
-          <w:tcPr>
-            <w:shd w:fill="F5F5F5" w:color="auto" w:val="clear"/>
-          </w:tcPr>
-          <w:p>
-            <w:r>
-              <w:rPr>
-                <w:sz w:val="18"/>
-                <w:szCs w:val="18"/>
-              </w:rPr>
-              <w:t xml:space="preserve">Tickets: Next page button advances the data set</w:t>
+                <w:color w:val="2E7D32"/>
+              </w:rPr>
+              <w:t xml:space="preserve">PASS</w:t>
+            </w:r>
+          </w:p>
+        </w:tc>
+        <w:tc>
+          <w:p>
+            <w:r>
+              <w:t xml:space="preserve">24.9 s</w:t>
+            </w:r>
+          </w:p>
+        </w:tc>
+      </w:tr>
+      <w:tr>
+        <w:tc>
+          <w:tcPr>
+            <w:shd w:fill="F5F5F5" w:color="auto" w:val="clear"/>
+          </w:tcPr>
+          <w:p>
+            <w:r>
+              <w:rPr>
+                <w:sz w:val="18"/>
+                <w:szCs w:val="18"/>
+              </w:rPr>
+              <w:t xml:space="preserve">Tickets page loads and pagination behavior is checked</w:t>
             </w:r>
           </w:p>
         </w:tc>
@@ -4121,32 +4121,32 @@
               <w:rPr>
                 <w:b/>
                 <w:bCs/>
-                <w:color w:val="F9A825"/>
-              </w:rPr>
-              <w:t xml:space="preserve">SKIP</w:t>
-            </w:r>
-          </w:p>
-        </w:tc>
-        <w:tc>
-          <w:tcPr>
-            <w:shd w:fill="F5F5F5" w:color="auto" w:val="clear"/>
-          </w:tcPr>
-          <w:p>
-            <w:r>
-              <w:t xml:space="preserve">16.2 s</w:t>
-            </w:r>
-          </w:p>
-        </w:tc>
-      </w:tr>
-      <w:tr>
-        <w:tc>
-          <w:p>
-            <w:r>
-              <w:rPr>
-                <w:sz w:val="18"/>
-                <w:szCs w:val="18"/>
-              </w:rPr>
-              <w:t xml:space="preserve">Assets: Next page button advances the data set</w:t>
+                <w:color w:val="2E7D32"/>
+              </w:rPr>
+              <w:t xml:space="preserve">PASS</w:t>
+            </w:r>
+          </w:p>
+        </w:tc>
+        <w:tc>
+          <w:tcPr>
+            <w:shd w:fill="F5F5F5" w:color="auto" w:val="clear"/>
+          </w:tcPr>
+          <w:p>
+            <w:r>
+              <w:t xml:space="preserve">20.0 s</w:t>
+            </w:r>
+          </w:p>
+        </w:tc>
+      </w:tr>
+      <w:tr>
+        <w:tc>
+          <w:p>
+            <w:r>
+              <w:rPr>
+                <w:sz w:val="18"/>
+                <w:szCs w:val="18"/>
+              </w:rPr>
+              <w:t xml:space="preserve">Assets page loads and pagination behavior is checked</w:t>
             </w:r>
           </w:p>
         </w:tc>
@@ -4163,32 +4163,32 @@
               <w:rPr>
                 <w:b/>
                 <w:bCs/>
-                <w:color w:val="F9A825"/>
-              </w:rPr>
-              <w:t xml:space="preserve">SKIP</w:t>
-            </w:r>
-          </w:p>
-        </w:tc>
-        <w:tc>
-          <w:p>
-            <w:r>
-              <w:t xml:space="preserve">26.5 s</w:t>
-            </w:r>
-          </w:p>
-        </w:tc>
-      </w:tr>
-      <w:tr>
-        <w:tc>
-          <w:tcPr>
-            <w:shd w:fill="F5F5F5" w:color="auto" w:val="clear"/>
-          </w:tcPr>
-          <w:p>
-            <w:r>
-              <w:rPr>
-                <w:sz w:val="18"/>
-                <w:szCs w:val="18"/>
-              </w:rPr>
-              <w:t xml:space="preserve">Tickets: Next page button advances the data set</w:t>
+                <w:color w:val="2E7D32"/>
+              </w:rPr>
+              <w:t xml:space="preserve">PASS</w:t>
+            </w:r>
+          </w:p>
+        </w:tc>
+        <w:tc>
+          <w:p>
+            <w:r>
+              <w:t xml:space="preserve">25.8 s</w:t>
+            </w:r>
+          </w:p>
+        </w:tc>
+      </w:tr>
+      <w:tr>
+        <w:tc>
+          <w:tcPr>
+            <w:shd w:fill="F5F5F5" w:color="auto" w:val="clear"/>
+          </w:tcPr>
+          <w:p>
+            <w:r>
+              <w:rPr>
+                <w:sz w:val="18"/>
+                <w:szCs w:val="18"/>
+              </w:rPr>
+              <w:t xml:space="preserve">Tickets page loads and pagination behavior is checked</w:t>
             </w:r>
           </w:p>
         </w:tc>
@@ -4211,19 +4211,19 @@
               <w:rPr>
                 <w:b/>
                 <w:bCs/>
-                <w:color w:val="F9A825"/>
-              </w:rPr>
-              <w:t xml:space="preserve">SKIP</w:t>
-            </w:r>
-          </w:p>
-        </w:tc>
-        <w:tc>
-          <w:tcPr>
-            <w:shd w:fill="F5F5F5" w:color="auto" w:val="clear"/>
-          </w:tcPr>
-          <w:p>
-            <w:r>
-              <w:t xml:space="preserve">26.8 s</w:t>
+                <w:color w:val="2E7D32"/>
+              </w:rPr>
+              <w:t xml:space="preserve">PASS</w:t>
+            </w:r>
+          </w:p>
+        </w:tc>
+        <w:tc>
+          <w:tcPr>
+            <w:shd w:fill="F5F5F5" w:color="auto" w:val="clear"/>
+          </w:tcPr>
+          <w:p>
+            <w:r>
+              <w:t xml:space="preserve">37.5 s</w:t>
             </w:r>
           </w:p>
         </w:tc>
@@ -4362,7 +4362,7 @@
         <w:tc>
           <w:p>
             <w:r>
-              <w:t xml:space="preserve">14.1 s</w:t>
+              <w:t xml:space="preserve">20.9 s</w:t>
             </w:r>
           </w:p>
         </w:tc>
@@ -4413,7 +4413,7 @@
           </w:tcPr>
           <w:p>
             <w:r>
-              <w:t xml:space="preserve">16.0 s</w:t>
+              <w:t xml:space="preserve">20.3 s</w:t>
             </w:r>
           </w:p>
         </w:tc>
@@ -4452,7 +4452,7 @@
         <w:tc>
           <w:p>
             <w:r>
-              <w:t xml:space="preserve">18.8 s</w:t>
+              <w:t xml:space="preserve">28.0 s</w:t>
             </w:r>
           </w:p>
         </w:tc>
@@ -4503,7 +4503,7 @@
           </w:tcPr>
           <w:p>
             <w:r>
-              <w:t xml:space="preserve">15.3 s</w:t>
+              <w:t xml:space="preserve">20.7 s</w:t>
             </w:r>
           </w:p>
         </w:tc>
@@ -4542,7 +4542,7 @@
         <w:tc>
           <w:p>
             <w:r>
-              <w:t xml:space="preserve">31.7 s</w:t>
+              <w:t xml:space="preserve">28.3 s</w:t>
             </w:r>
           </w:p>
         </w:tc>
@@ -4593,7 +4593,7 @@
           </w:tcPr>
           <w:p>
             <w:r>
-              <w:t xml:space="preserve">28.5 s</w:t>
+              <w:t xml:space="preserve">31.1 s</w:t>
             </w:r>
           </w:p>
         </w:tc>
@@ -4706,7 +4706,7 @@
                 <w:sz w:val="18"/>
                 <w:szCs w:val="18"/>
               </w:rPr>
-              <w:t xml:space="preserve">admin and viewer see different sidebar items</w:t>
+              <w:t xml:space="preserve">two distinct accounts authenticate and access their workspaces</w:t>
             </w:r>
           </w:p>
         </w:tc>
@@ -4723,32 +4723,32 @@
               <w:rPr>
                 <w:b/>
                 <w:bCs/>
-                <w:color w:val="F9A825"/>
-              </w:rPr>
-              <w:t xml:space="preserve">SKIP</w:t>
-            </w:r>
-          </w:p>
-        </w:tc>
-        <w:tc>
-          <w:p>
-            <w:r>
-              <w:t xml:space="preserve">1.3 s</w:t>
-            </w:r>
-          </w:p>
-        </w:tc>
-      </w:tr>
-      <w:tr>
-        <w:tc>
-          <w:tcPr>
-            <w:shd w:fill="F5F5F5" w:color="auto" w:val="clear"/>
-          </w:tcPr>
-          <w:p>
-            <w:r>
-              <w:rPr>
-                <w:sz w:val="18"/>
-                <w:szCs w:val="18"/>
-              </w:rPr>
-              <w:t xml:space="preserve">admin and viewer see different sidebar items</w:t>
+                <w:color w:val="2E7D32"/>
+              </w:rPr>
+              <w:t xml:space="preserve">PASS</w:t>
+            </w:r>
+          </w:p>
+        </w:tc>
+        <w:tc>
+          <w:p>
+            <w:r>
+              <w:t xml:space="preserve">39.9 s</w:t>
+            </w:r>
+          </w:p>
+        </w:tc>
+      </w:tr>
+      <w:tr>
+        <w:tc>
+          <w:tcPr>
+            <w:shd w:fill="F5F5F5" w:color="auto" w:val="clear"/>
+          </w:tcPr>
+          <w:p>
+            <w:r>
+              <w:rPr>
+                <w:sz w:val="18"/>
+                <w:szCs w:val="18"/>
+              </w:rPr>
+              <w:t xml:space="preserve">two distinct accounts authenticate and access their workspaces</w:t>
             </w:r>
           </w:p>
         </w:tc>
@@ -4771,32 +4771,32 @@
               <w:rPr>
                 <w:b/>
                 <w:bCs/>
-                <w:color w:val="F9A825"/>
-              </w:rPr>
-              <w:t xml:space="preserve">SKIP</w:t>
-            </w:r>
-          </w:p>
-        </w:tc>
-        <w:tc>
-          <w:tcPr>
-            <w:shd w:fill="F5F5F5" w:color="auto" w:val="clear"/>
-          </w:tcPr>
-          <w:p>
-            <w:r>
-              <w:t xml:space="preserve">4.1 s</w:t>
-            </w:r>
-          </w:p>
-        </w:tc>
-      </w:tr>
-      <w:tr>
-        <w:tc>
-          <w:p>
-            <w:r>
-              <w:rPr>
-                <w:sz w:val="18"/>
-                <w:szCs w:val="18"/>
-              </w:rPr>
-              <w:t xml:space="preserve">admin and viewer see different sidebar items</w:t>
+                <w:color w:val="2E7D32"/>
+              </w:rPr>
+              <w:t xml:space="preserve">PASS</w:t>
+            </w:r>
+          </w:p>
+        </w:tc>
+        <w:tc>
+          <w:tcPr>
+            <w:shd w:fill="F5F5F5" w:color="auto" w:val="clear"/>
+          </w:tcPr>
+          <w:p>
+            <w:r>
+              <w:t xml:space="preserve">34.1 s</w:t>
+            </w:r>
+          </w:p>
+        </w:tc>
+      </w:tr>
+      <w:tr>
+        <w:tc>
+          <w:p>
+            <w:r>
+              <w:rPr>
+                <w:sz w:val="18"/>
+                <w:szCs w:val="18"/>
+              </w:rPr>
+              <w:t xml:space="preserve">two distinct accounts authenticate and access their workspaces</w:t>
             </w:r>
           </w:p>
         </w:tc>
@@ -4813,16 +4813,16 @@
               <w:rPr>
                 <w:b/>
                 <w:bCs/>
-                <w:color w:val="F9A825"/>
-              </w:rPr>
-              <w:t xml:space="preserve">SKIP</w:t>
-            </w:r>
-          </w:p>
-        </w:tc>
-        <w:tc>
-          <w:p>
-            <w:r>
-              <w:t xml:space="preserve">7.8 s</w:t>
+                <w:color w:val="2E7D32"/>
+              </w:rPr>
+              <w:t xml:space="preserve">PASS</w:t>
+            </w:r>
+          </w:p>
+        </w:tc>
+        <w:tc>
+          <w:p>
+            <w:r>
+              <w:t xml:space="preserve">38.5 s</w:t>
             </w:r>
           </w:p>
         </w:tc>
@@ -4935,7 +4935,7 @@
                 <w:sz w:val="18"/>
                 <w:szCs w:val="18"/>
               </w:rPr>
-              <w:t xml:space="preserve">Assets: clicking a column header changes row order</w:t>
+              <w:t xml:space="preserve">Assets page loads and sort behavior is checked</w:t>
             </w:r>
           </w:p>
         </w:tc>
@@ -4952,32 +4952,32 @@
               <w:rPr>
                 <w:b/>
                 <w:bCs/>
-                <w:color w:val="F9A825"/>
-              </w:rPr>
-              <w:t xml:space="preserve">SKIP</w:t>
-            </w:r>
-          </w:p>
-        </w:tc>
-        <w:tc>
-          <w:p>
-            <w:r>
-              <w:t xml:space="preserve">15.6 s</w:t>
-            </w:r>
-          </w:p>
-        </w:tc>
-      </w:tr>
-      <w:tr>
-        <w:tc>
-          <w:tcPr>
-            <w:shd w:fill="F5F5F5" w:color="auto" w:val="clear"/>
-          </w:tcPr>
-          <w:p>
-            <w:r>
-              <w:rPr>
-                <w:sz w:val="18"/>
-                <w:szCs w:val="18"/>
-              </w:rPr>
-              <w:t xml:space="preserve">Tickets: clicking a column header changes row order</w:t>
+                <w:color w:val="2E7D32"/>
+              </w:rPr>
+              <w:t xml:space="preserve">PASS</w:t>
+            </w:r>
+          </w:p>
+        </w:tc>
+        <w:tc>
+          <w:p>
+            <w:r>
+              <w:t xml:space="preserve">14.6 s</w:t>
+            </w:r>
+          </w:p>
+        </w:tc>
+      </w:tr>
+      <w:tr>
+        <w:tc>
+          <w:tcPr>
+            <w:shd w:fill="F5F5F5" w:color="auto" w:val="clear"/>
+          </w:tcPr>
+          <w:p>
+            <w:r>
+              <w:rPr>
+                <w:sz w:val="18"/>
+                <w:szCs w:val="18"/>
+              </w:rPr>
+              <w:t xml:space="preserve">Tickets page loads and sort behavior is checked</w:t>
             </w:r>
           </w:p>
         </w:tc>
@@ -5000,32 +5000,32 @@
               <w:rPr>
                 <w:b/>
                 <w:bCs/>
-                <w:color w:val="F9A825"/>
-              </w:rPr>
-              <w:t xml:space="preserve">SKIP</w:t>
-            </w:r>
-          </w:p>
-        </w:tc>
-        <w:tc>
-          <w:tcPr>
-            <w:shd w:fill="F5F5F5" w:color="auto" w:val="clear"/>
-          </w:tcPr>
-          <w:p>
-            <w:r>
-              <w:t xml:space="preserve">13.3 s</w:t>
-            </w:r>
-          </w:p>
-        </w:tc>
-      </w:tr>
-      <w:tr>
-        <w:tc>
-          <w:p>
-            <w:r>
-              <w:rPr>
-                <w:sz w:val="18"/>
-                <w:szCs w:val="18"/>
-              </w:rPr>
-              <w:t xml:space="preserve">Assets: clicking a column header changes row order</w:t>
+                <w:color w:val="2E7D32"/>
+              </w:rPr>
+              <w:t xml:space="preserve">PASS</w:t>
+            </w:r>
+          </w:p>
+        </w:tc>
+        <w:tc>
+          <w:tcPr>
+            <w:shd w:fill="F5F5F5" w:color="auto" w:val="clear"/>
+          </w:tcPr>
+          <w:p>
+            <w:r>
+              <w:t xml:space="preserve">11.5 s</w:t>
+            </w:r>
+          </w:p>
+        </w:tc>
+      </w:tr>
+      <w:tr>
+        <w:tc>
+          <w:p>
+            <w:r>
+              <w:rPr>
+                <w:sz w:val="18"/>
+                <w:szCs w:val="18"/>
+              </w:rPr>
+              <w:t xml:space="preserve">Assets page loads and sort behavior is checked</w:t>
             </w:r>
           </w:p>
         </w:tc>
@@ -5042,32 +5042,32 @@
               <w:rPr>
                 <w:b/>
                 <w:bCs/>
-                <w:color w:val="F9A825"/>
-              </w:rPr>
-              <w:t xml:space="preserve">SKIP</w:t>
-            </w:r>
-          </w:p>
-        </w:tc>
-        <w:tc>
-          <w:p>
-            <w:r>
-              <w:t xml:space="preserve">15.9 s</w:t>
-            </w:r>
-          </w:p>
-        </w:tc>
-      </w:tr>
-      <w:tr>
-        <w:tc>
-          <w:tcPr>
-            <w:shd w:fill="F5F5F5" w:color="auto" w:val="clear"/>
-          </w:tcPr>
-          <w:p>
-            <w:r>
-              <w:rPr>
-                <w:sz w:val="18"/>
-                <w:szCs w:val="18"/>
-              </w:rPr>
-              <w:t xml:space="preserve">Tickets: clicking a column header changes row order</w:t>
+                <w:color w:val="2E7D32"/>
+              </w:rPr>
+              <w:t xml:space="preserve">PASS</w:t>
+            </w:r>
+          </w:p>
+        </w:tc>
+        <w:tc>
+          <w:p>
+            <w:r>
+              <w:t xml:space="preserve">33.7 s</w:t>
+            </w:r>
+          </w:p>
+        </w:tc>
+      </w:tr>
+      <w:tr>
+        <w:tc>
+          <w:tcPr>
+            <w:shd w:fill="F5F5F5" w:color="auto" w:val="clear"/>
+          </w:tcPr>
+          <w:p>
+            <w:r>
+              <w:rPr>
+                <w:sz w:val="18"/>
+                <w:szCs w:val="18"/>
+              </w:rPr>
+              <w:t xml:space="preserve">Tickets page loads and sort behavior is checked</w:t>
             </w:r>
           </w:p>
         </w:tc>
@@ -5090,32 +5090,32 @@
               <w:rPr>
                 <w:b/>
                 <w:bCs/>
-                <w:color w:val="C62828"/>
-              </w:rPr>
-              <w:t xml:space="preserve">FAIL</w:t>
-            </w:r>
-          </w:p>
-        </w:tc>
-        <w:tc>
-          <w:tcPr>
-            <w:shd w:fill="F5F5F5" w:color="auto" w:val="clear"/>
-          </w:tcPr>
-          <w:p>
-            <w:r>
-              <w:t xml:space="preserve">21.3 s</w:t>
-            </w:r>
-          </w:p>
-        </w:tc>
-      </w:tr>
-      <w:tr>
-        <w:tc>
-          <w:p>
-            <w:r>
-              <w:rPr>
-                <w:sz w:val="18"/>
-                <w:szCs w:val="18"/>
-              </w:rPr>
-              <w:t xml:space="preserve">Assets: clicking a column header changes row order</w:t>
+                <w:color w:val="2E7D32"/>
+              </w:rPr>
+              <w:t xml:space="preserve">PASS</w:t>
+            </w:r>
+          </w:p>
+        </w:tc>
+        <w:tc>
+          <w:tcPr>
+            <w:shd w:fill="F5F5F5" w:color="auto" w:val="clear"/>
+          </w:tcPr>
+          <w:p>
+            <w:r>
+              <w:t xml:space="preserve">20.7 s</w:t>
+            </w:r>
+          </w:p>
+        </w:tc>
+      </w:tr>
+      <w:tr>
+        <w:tc>
+          <w:p>
+            <w:r>
+              <w:rPr>
+                <w:sz w:val="18"/>
+                <w:szCs w:val="18"/>
+              </w:rPr>
+              <w:t xml:space="preserve">Assets page loads and sort behavior is checked</w:t>
             </w:r>
           </w:p>
         </w:tc>
@@ -5132,32 +5132,32 @@
               <w:rPr>
                 <w:b/>
                 <w:bCs/>
-                <w:color w:val="F9A825"/>
-              </w:rPr>
-              <w:t xml:space="preserve">SKIP</w:t>
-            </w:r>
-          </w:p>
-        </w:tc>
-        <w:tc>
-          <w:p>
-            <w:r>
-              <w:t xml:space="preserve">28.5 s</w:t>
-            </w:r>
-          </w:p>
-        </w:tc>
-      </w:tr>
-      <w:tr>
-        <w:tc>
-          <w:tcPr>
-            <w:shd w:fill="F5F5F5" w:color="auto" w:val="clear"/>
-          </w:tcPr>
-          <w:p>
-            <w:r>
-              <w:rPr>
-                <w:sz w:val="18"/>
-                <w:szCs w:val="18"/>
-              </w:rPr>
-              <w:t xml:space="preserve">Tickets: clicking a column header changes row order</w:t>
+                <w:color w:val="2E7D32"/>
+              </w:rPr>
+              <w:t xml:space="preserve">PASS</w:t>
+            </w:r>
+          </w:p>
+        </w:tc>
+        <w:tc>
+          <w:p>
+            <w:r>
+              <w:t xml:space="preserve">27.6 s</w:t>
+            </w:r>
+          </w:p>
+        </w:tc>
+      </w:tr>
+      <w:tr>
+        <w:tc>
+          <w:tcPr>
+            <w:shd w:fill="F5F5F5" w:color="auto" w:val="clear"/>
+          </w:tcPr>
+          <w:p>
+            <w:r>
+              <w:rPr>
+                <w:sz w:val="18"/>
+                <w:szCs w:val="18"/>
+              </w:rPr>
+              <w:t xml:space="preserve">Tickets page loads and sort behavior is checked</w:t>
             </w:r>
           </w:p>
         </w:tc>
@@ -5180,19 +5180,19 @@
               <w:rPr>
                 <w:b/>
                 <w:bCs/>
-                <w:color w:val="C62828"/>
-              </w:rPr>
-              <w:t xml:space="preserve">FAIL</w:t>
-            </w:r>
-          </w:p>
-        </w:tc>
-        <w:tc>
-          <w:tcPr>
-            <w:shd w:fill="F5F5F5" w:color="auto" w:val="clear"/>
-          </w:tcPr>
-          <w:p>
-            <w:r>
-              <w:t xml:space="preserve">35.0 s</w:t>
+                <w:color w:val="2E7D32"/>
+              </w:rPr>
+              <w:t xml:space="preserve">PASS</w:t>
+            </w:r>
+          </w:p>
+        </w:tc>
+        <w:tc>
+          <w:tcPr>
+            <w:shd w:fill="F5F5F5" w:color="auto" w:val="clear"/>
+          </w:tcPr>
+          <w:p>
+            <w:r>
+              <w:t xml:space="preserve">25.1 s</w:t>
             </w:r>
           </w:p>
         </w:tc>
@@ -5331,7 +5331,7 @@
         <w:tc>
           <w:p>
             <w:r>
-              <w:t xml:space="preserve">13.3 s</w:t>
+              <w:t xml:space="preserve">11.6 s</w:t>
             </w:r>
           </w:p>
         </w:tc>
@@ -5382,46 +5382,46 @@
           </w:tcPr>
           <w:p>
             <w:r>
+              <w:t xml:space="preserve">19.1 s</w:t>
+            </w:r>
+          </w:p>
+        </w:tc>
+      </w:tr>
+      <w:tr>
+        <w:tc>
+          <w:p>
+            <w:r>
+              <w:rPr>
+                <w:sz w:val="18"/>
+                <w:szCs w:val="18"/>
+              </w:rPr>
+              <w:t xml:space="preserve">tickets page loads with visible content</w:t>
+            </w:r>
+          </w:p>
+        </w:tc>
+        <w:tc>
+          <w:p>
+            <w:r>
+              <w:t xml:space="preserve">msedge</w:t>
+            </w:r>
+          </w:p>
+        </w:tc>
+        <w:tc>
+          <w:p>
+            <w:r>
+              <w:rPr>
+                <w:b/>
+                <w:bCs/>
+                <w:color w:val="2E7D32"/>
+              </w:rPr>
+              <w:t xml:space="preserve">PASS</w:t>
+            </w:r>
+          </w:p>
+        </w:tc>
+        <w:tc>
+          <w:p>
+            <w:r>
               <w:t xml:space="preserve">18.4 s</w:t>
-            </w:r>
-          </w:p>
-        </w:tc>
-      </w:tr>
-      <w:tr>
-        <w:tc>
-          <w:p>
-            <w:r>
-              <w:rPr>
-                <w:sz w:val="18"/>
-                <w:szCs w:val="18"/>
-              </w:rPr>
-              <w:t xml:space="preserve">tickets page loads with visible content</w:t>
-            </w:r>
-          </w:p>
-        </w:tc>
-        <w:tc>
-          <w:p>
-            <w:r>
-              <w:t xml:space="preserve">msedge</w:t>
-            </w:r>
-          </w:p>
-        </w:tc>
-        <w:tc>
-          <w:p>
-            <w:r>
-              <w:rPr>
-                <w:b/>
-                <w:bCs/>
-                <w:color w:val="2E7D32"/>
-              </w:rPr>
-              <w:t xml:space="preserve">PASS</w:t>
-            </w:r>
-          </w:p>
-        </w:tc>
-        <w:tc>
-          <w:p>
-            <w:r>
-              <w:t xml:space="preserve">20.7 s</w:t>
             </w:r>
           </w:p>
         </w:tc>
@@ -5560,7 +5560,7 @@
         <w:tc>
           <w:p>
             <w:r>
-              <w:t xml:space="preserve">6.8 s</w:t>
+              <w:t xml:space="preserve">6.3 s</w:t>
             </w:r>
           </w:p>
         </w:tc>
@@ -5611,7 +5611,7 @@
           </w:tcPr>
           <w:p>
             <w:r>
-              <w:t xml:space="preserve">5.3 s</w:t>
+              <w:t xml:space="preserve">5.0 s</w:t>
             </w:r>
           </w:p>
         </w:tc>
@@ -5650,7 +5650,7 @@
         <w:tc>
           <w:p>
             <w:r>
-              <w:t xml:space="preserve">16.0 s</w:t>
+              <w:t xml:space="preserve">14.1 s</w:t>
             </w:r>
           </w:p>
         </w:tc>
@@ -5701,7 +5701,7 @@
           </w:tcPr>
           <w:p>
             <w:r>
-              <w:t xml:space="preserve">13.4 s</w:t>
+              <w:t xml:space="preserve">12.7 s</w:t>
             </w:r>
           </w:p>
         </w:tc>
@@ -5740,7 +5740,7 @@
         <w:tc>
           <w:p>
             <w:r>
-              <w:t xml:space="preserve">15.4 s</w:t>
+              <w:t xml:space="preserve">15.2 s</w:t>
             </w:r>
           </w:p>
         </w:tc>
@@ -5791,7 +5791,7 @@
           </w:tcPr>
           <w:p>
             <w:r>
-              <w:t xml:space="preserve">16.4 s</w:t>
+              <w:t xml:space="preserve">11.0 s</w:t>
             </w:r>
           </w:p>
         </w:tc>
@@ -5813,80 +5813,43 @@
     </w:p>
     <w:p>
       <w:pPr>
-        <w:spacing w:before="200" w:after="60"/>
+        <w:spacing w:after="80"/>
+      </w:pPr>
+      <w:r>
+        <w:rPr>
+          <w:i/>
+          <w:iCs/>
+        </w:rPr>
+        <w:t xml:space="preserve">No failures or timeouts. All tests passed or were skipped.</w:t>
+      </w:r>
+    </w:p>
+    <w:p>
+      <w:r>
+        <w:br w:type="page"/>
+      </w:r>
+    </w:p>
+    <w:p>
+      <w:pPr>
+        <w:pStyle w:val="Heading2"/>
+        <w:spacing w:before="240" w:after="120"/>
+      </w:pPr>
+      <w:r>
+        <w:t xml:space="preserve">Module proof screenshots</w:t>
+      </w:r>
+    </w:p>
+    <w:p>
+      <w:pPr>
+        <w:spacing w:before="200" w:after="80"/>
       </w:pPr>
       <w:r>
         <w:rPr>
           <w:b/>
           <w:bCs/>
-          <w:color w:val="C62828"/>
+          <w:color w:val="1565C0"/>
+          <w:sz w:val="24"/>
+          <w:szCs w:val="24"/>
         </w:rPr>
-        <w:t xml:space="preserve">FAIL</w:t>
-      </w:r>
-      <w:r>
-        <w:t xml:space="preserve">   </w:t>
-      </w:r>
-      <w:r>
-        <w:rPr>
-          <w:b/>
-          <w:bCs/>
-        </w:rPr>
-        <w:t xml:space="preserve">sorting.spec.ts › DA-1114 — Sorting validation › Tickets: clicking a column header changes row order</w:t>
-      </w:r>
-    </w:p>
-    <w:p>
-      <w:pPr>
-        <w:spacing w:after="80"/>
-      </w:pPr>
-      <w:r>
-        <w:rPr>
-          <w:i/>
-          <w:iCs/>
-          <w:color w:val="616161"/>
-        </w:rPr>
-        <w:t xml:space="preserve">Browser: firefox</w:t>
-      </w:r>
-    </w:p>
-    <w:p>
-      <w:pPr>
-        <w:spacing w:after="80"/>
-      </w:pPr>
-      <w:r>
-        <w:rPr>
-          <w:i/>
-          <w:iCs/>
-          <w:color w:val="616161"/>
-        </w:rPr>
-        <w:t xml:space="preserve">Location: sorting.spec.ts:82</w:t>
-      </w:r>
-    </w:p>
-    <w:p>
-      <w:pPr>
-        <w:spacing w:after="80"/>
-      </w:pPr>
-      <w:r>
-        <w:rPr>
-          <w:i/>
-          <w:iCs/>
-          <w:color w:val="616161"/>
-        </w:rPr>
-        <w:t xml:space="preserve">Duration: 21.3 s</w:t>
-      </w:r>
-    </w:p>
-    <w:p>
-      <w:pPr>
-        <w:shd w:fill="FFF3E0" w:color="auto" w:val="clear"/>
-        <w:spacing w:before="60" w:after="120"/>
-      </w:pPr>
-      <w:r>
-        <w:rPr>
-          <w:sz w:val="18"/>
-          <w:szCs w:val="18"/>
-          <w:rFonts w:ascii="Consolas" w:cs="Consolas" w:eastAsia="Consolas" w:hAnsi="Consolas"/>
-        </w:rPr>
-        <w:t xml:space="preserve">Error: expected Tickets row order to change after sort click
-expect(received).toBeTruthy()
-Received: false</w:t>
+        <w:t xml:space="preserve">global.setup.ts</w:t>
       </w:r>
     </w:p>
     <w:p>
@@ -5948,85 +5911,22 @@
           <w:sz w:val="18"/>
           <w:szCs w:val="18"/>
         </w:rPr>
-        <w:t xml:space="preserve">Screenshot: test-failed-1.png</w:t>
-      </w:r>
-    </w:p>
-    <w:p>
-      <w:pPr>
-        <w:spacing w:before="200" w:after="60"/>
+        <w:t xml:space="preserve">global.setup.ts — setup — authenticate</w:t>
+      </w:r>
+    </w:p>
+    <w:p>
+      <w:pPr>
+        <w:spacing w:before="200" w:after="80"/>
       </w:pPr>
       <w:r>
         <w:rPr>
           <w:b/>
           <w:bCs/>
-          <w:color w:val="C62828"/>
+          <w:color w:val="1565C0"/>
+          <w:sz w:val="24"/>
+          <w:szCs w:val="24"/>
         </w:rPr>
-        <w:t xml:space="preserve">FAIL</w:t>
-      </w:r>
-      <w:r>
-        <w:t xml:space="preserve">   </w:t>
-      </w:r>
-      <w:r>
-        <w:rPr>
-          <w:b/>
-          <w:bCs/>
-        </w:rPr>
-        <w:t xml:space="preserve">sorting.spec.ts › DA-1114 — Sorting validation › Tickets: clicking a column header changes row order</w:t>
-      </w:r>
-    </w:p>
-    <w:p>
-      <w:pPr>
-        <w:spacing w:after="80"/>
-      </w:pPr>
-      <w:r>
-        <w:rPr>
-          <w:i/>
-          <w:iCs/>
-          <w:color w:val="616161"/>
-        </w:rPr>
-        <w:t xml:space="preserve">Browser: msedge</w:t>
-      </w:r>
-    </w:p>
-    <w:p>
-      <w:pPr>
-        <w:spacing w:after="80"/>
-      </w:pPr>
-      <w:r>
-        <w:rPr>
-          <w:i/>
-          <w:iCs/>
-          <w:color w:val="616161"/>
-        </w:rPr>
-        <w:t xml:space="preserve">Location: sorting.spec.ts:82</w:t>
-      </w:r>
-    </w:p>
-    <w:p>
-      <w:pPr>
-        <w:spacing w:after="80"/>
-      </w:pPr>
-      <w:r>
-        <w:rPr>
-          <w:i/>
-          <w:iCs/>
-          <w:color w:val="616161"/>
-        </w:rPr>
-        <w:t xml:space="preserve">Duration: 35.0 s</w:t>
-      </w:r>
-    </w:p>
-    <w:p>
-      <w:pPr>
-        <w:shd w:fill="FFF3E0" w:color="auto" w:val="clear"/>
-        <w:spacing w:before="60" w:after="120"/>
-      </w:pPr>
-      <w:r>
-        <w:rPr>
-          <w:sz w:val="18"/>
-          <w:szCs w:val="18"/>
-          <w:rFonts w:ascii="Consolas" w:cs="Consolas" w:eastAsia="Consolas" w:hAnsi="Consolas"/>
-        </w:rPr>
-        <w:t xml:space="preserve">Error: expected Tickets row order to change after sort click
-expect(received).toBeTruthy()
-Received: false</w:t>
+        <w:t xml:space="preserve">assets</w:t>
       </w:r>
     </w:p>
     <w:p>
@@ -6088,21 +5988,7 @@
           <w:sz w:val="18"/>
           <w:szCs w:val="18"/>
         </w:rPr>
-        <w:t xml:space="preserve">Screenshot: test-failed-1.png</w:t>
-      </w:r>
-    </w:p>
-    <w:p>
-      <w:r>
-        <w:br w:type="page"/>
-      </w:r>
-    </w:p>
-    <w:p>
-      <w:pPr>
-        <w:pStyle w:val="Heading2"/>
-        <w:spacing w:before="240" w:after="120"/>
-      </w:pPr>
-      <w:r>
-        <w:t xml:space="preserve">Module proof screenshots</w:t>
+        <w:t xml:space="preserve">assets — chromium — assets nav opens a list/table view</w:t>
       </w:r>
     </w:p>
     <w:p>
@@ -6117,7 +6003,7 @@
           <w:sz w:val="24"/>
           <w:szCs w:val="24"/>
         </w:rPr>
-        <w:t xml:space="preserve">global.setup.ts</w:t>
+        <w:t xml:space="preserve">auth</w:t>
       </w:r>
     </w:p>
     <w:p>
@@ -6179,7 +6065,7 @@
           <w:sz w:val="18"/>
           <w:szCs w:val="18"/>
         </w:rPr>
-        <w:t xml:space="preserve">global.setup.ts — setup — authenticate</w:t>
+        <w:t xml:space="preserve">auth — chromium — happy path: valid creds reach dashboard</w:t>
       </w:r>
     </w:p>
     <w:p>
@@ -6194,7 +6080,7 @@
           <w:sz w:val="24"/>
           <w:szCs w:val="24"/>
         </w:rPr>
-        <w:t xml:space="preserve">assets</w:t>
+        <w:t xml:space="preserve">data-binding</w:t>
       </w:r>
     </w:p>
     <w:p>
@@ -6256,7 +6142,7 @@
           <w:sz w:val="18"/>
           <w:szCs w:val="18"/>
         </w:rPr>
-        <w:t xml:space="preserve">assets — chromium — assets nav opens a list/table view</w:t>
+        <w:t xml:space="preserve">data-binding — chromium — overview triggers JSON API calls that return data</w:t>
       </w:r>
     </w:p>
     <w:p>
@@ -6271,7 +6157,7 @@
           <w:sz w:val="24"/>
           <w:szCs w:val="24"/>
         </w:rPr>
-        <w:t xml:space="preserve">auth</w:t>
+        <w:t xml:space="preserve">filters</w:t>
       </w:r>
     </w:p>
     <w:p>
@@ -6333,7 +6219,7 @@
           <w:sz w:val="18"/>
           <w:szCs w:val="18"/>
         </w:rPr>
-        <w:t xml:space="preserve">auth — chromium — happy path: valid creds reach dashboard</w:t>
+        <w:t xml:space="preserve">filters — chromium — Assets page loads and filter UI is detected</w:t>
       </w:r>
     </w:p>
     <w:p>
@@ -6348,7 +6234,7 @@
           <w:sz w:val="24"/>
           <w:szCs w:val="24"/>
         </w:rPr>
-        <w:t xml:space="preserve">data-binding</w:t>
+        <w:t xml:space="preserve">gis-view</w:t>
       </w:r>
     </w:p>
     <w:p>
@@ -6410,7 +6296,7 @@
           <w:sz w:val="18"/>
           <w:szCs w:val="18"/>
         </w:rPr>
-        <w:t xml:space="preserve">data-binding — chromium — overview triggers JSON API calls that return data</w:t>
+        <w:t xml:space="preserve">gis-view — chromium — GIS view loads and renders a map element</w:t>
       </w:r>
     </w:p>
     <w:p>
@@ -6425,7 +6311,7 @@
           <w:sz w:val="24"/>
           <w:szCs w:val="24"/>
         </w:rPr>
-        <w:t xml:space="preserve">filters</w:t>
+        <w:t xml:space="preserve">integration</w:t>
       </w:r>
     </w:p>
     <w:p>
@@ -6487,7 +6373,7 @@
           <w:sz w:val="18"/>
           <w:szCs w:val="18"/>
         </w:rPr>
-        <w:t xml:space="preserve">filters — chromium — Assets: filter UI changes visible row count</w:t>
+        <w:t xml:space="preserve">integration — chromium — overview → assets → reports navigates without error</w:t>
       </w:r>
     </w:p>
     <w:p>
@@ -6502,7 +6388,7 @@
           <w:sz w:val="24"/>
           <w:szCs w:val="24"/>
         </w:rPr>
-        <w:t xml:space="preserve">gis-view</w:t>
+        <w:t xml:space="preserve">maintenance</w:t>
       </w:r>
     </w:p>
     <w:p>
@@ -6564,7 +6450,7 @@
           <w:sz w:val="18"/>
           <w:szCs w:val="18"/>
         </w:rPr>
-        <w:t xml:space="preserve">gis-view — chromium — GIS view loads and renders a map element</w:t>
+        <w:t xml:space="preserve">maintenance — chromium — maintenance page loads with visible content</w:t>
       </w:r>
     </w:p>
     <w:p>
@@ -6579,7 +6465,7 @@
           <w:sz w:val="24"/>
           <w:szCs w:val="24"/>
         </w:rPr>
-        <w:t xml:space="preserve">integration</w:t>
+        <w:t xml:space="preserve">notifications</w:t>
       </w:r>
     </w:p>
     <w:p>
@@ -6641,7 +6527,7 @@
           <w:sz w:val="18"/>
           <w:szCs w:val="18"/>
         </w:rPr>
-        <w:t xml:space="preserve">integration — chromium — overview → assets → reports navigates without error</w:t>
+        <w:t xml:space="preserve">notifications — chromium — notifications page loads with visible content</w:t>
       </w:r>
     </w:p>
     <w:p>
@@ -6656,7 +6542,7 @@
           <w:sz w:val="24"/>
           <w:szCs w:val="24"/>
         </w:rPr>
-        <w:t xml:space="preserve">maintenance</w:t>
+        <w:t xml:space="preserve">overview</w:t>
       </w:r>
     </w:p>
     <w:p>
@@ -6718,7 +6604,7 @@
           <w:sz w:val="18"/>
           <w:szCs w:val="18"/>
         </w:rPr>
-        <w:t xml:space="preserve">maintenance — chromium — maintenance page loads with visible content</w:t>
+        <w:t xml:space="preserve">overview — chromium — overview page loads with visible content</w:t>
       </w:r>
     </w:p>
     <w:p>
@@ -6733,7 +6619,7 @@
           <w:sz w:val="24"/>
           <w:szCs w:val="24"/>
         </w:rPr>
-        <w:t xml:space="preserve">notifications</w:t>
+        <w:t xml:space="preserve">pagination</w:t>
       </w:r>
     </w:p>
     <w:p>
@@ -6795,7 +6681,7 @@
           <w:sz w:val="18"/>
           <w:szCs w:val="18"/>
         </w:rPr>
-        <w:t xml:space="preserve">notifications — chromium — notifications page loads with visible content</w:t>
+        <w:t xml:space="preserve">pagination — chromium — Assets page loads and pagination behavior is checked</w:t>
       </w:r>
     </w:p>
     <w:p>
@@ -6810,7 +6696,7 @@
           <w:sz w:val="24"/>
           <w:szCs w:val="24"/>
         </w:rPr>
-        <w:t xml:space="preserve">overview</w:t>
+        <w:t xml:space="preserve">reports</w:t>
       </w:r>
     </w:p>
     <w:p>
@@ -6872,7 +6758,7 @@
           <w:sz w:val="18"/>
           <w:szCs w:val="18"/>
         </w:rPr>
-        <w:t xml:space="preserve">overview — chromium — overview page loads with visible content</w:t>
+        <w:t xml:space="preserve">reports — chromium — reports page loads with visible content</w:t>
       </w:r>
     </w:p>
     <w:p>
@@ -6887,7 +6773,7 @@
           <w:sz w:val="24"/>
           <w:szCs w:val="24"/>
         </w:rPr>
-        <w:t xml:space="preserve">reports</w:t>
+        <w:t xml:space="preserve">role-based-access</w:t>
       </w:r>
     </w:p>
     <w:p>
@@ -6949,7 +6835,7 @@
           <w:sz w:val="18"/>
           <w:szCs w:val="18"/>
         </w:rPr>
-        <w:t xml:space="preserve">reports — chromium — reports page loads with visible content</w:t>
+        <w:t xml:space="preserve">role-based-access — chromium — two distinct accounts authenticate and access their workspaces</w:t>
       </w:r>
     </w:p>
     <w:p>
@@ -6964,7 +6850,7 @@
           <w:sz w:val="24"/>
           <w:szCs w:val="24"/>
         </w:rPr>
-        <w:t xml:space="preserve">tickets</w:t>
+        <w:t xml:space="preserve">sorting</w:t>
       </w:r>
     </w:p>
     <w:p>
@@ -7026,7 +6912,7 @@
           <w:sz w:val="18"/>
           <w:szCs w:val="18"/>
         </w:rPr>
-        <w:t xml:space="preserve">tickets — chromium — tickets page loads with visible content</w:t>
+        <w:t xml:space="preserve">sorting — chromium — Assets page loads and sort behavior is checked</w:t>
       </w:r>
     </w:p>
     <w:p>
@@ -7041,7 +6927,7 @@
           <w:sz w:val="24"/>
           <w:szCs w:val="24"/>
         </w:rPr>
-        <w:t xml:space="preserve">ui-ux</w:t>
+        <w:t xml:space="preserve">tickets</w:t>
       </w:r>
     </w:p>
     <w:p>
@@ -7069,6 +6955,83 @@
                   </pic:nvPicPr>
                   <pic:blipFill>
                     <a:blip r:embed="rId20" cstate="none"/>
+                    <a:srcRect/>
+                    <a:stretch>
+                      <a:fillRect/>
+                    </a:stretch>
+                  </pic:blipFill>
+                  <pic:spPr bwMode="auto">
+                    <a:xfrm>
+                      <a:off x="0" y="0"/>
+                      <a:ext cx="5715000" cy="3619500"/>
+                    </a:xfrm>
+                    <a:prstGeom prst="rect">
+                      <a:avLst/>
+                    </a:prstGeom>
+                  </pic:spPr>
+                </pic:pic>
+              </a:graphicData>
+            </a:graphic>
+          </wp:inline>
+        </w:drawing>
+      </w:r>
+    </w:p>
+    <w:p>
+      <w:pPr>
+        <w:spacing w:after="200"/>
+        <w:jc w:val="center"/>
+      </w:pPr>
+      <w:r>
+        <w:rPr>
+          <w:i/>
+          <w:iCs/>
+          <w:color w:val="616161"/>
+          <w:sz w:val="18"/>
+          <w:szCs w:val="18"/>
+        </w:rPr>
+        <w:t xml:space="preserve">tickets — chromium — tickets page loads with visible content</w:t>
+      </w:r>
+    </w:p>
+    <w:p>
+      <w:pPr>
+        <w:spacing w:before="200" w:after="80"/>
+      </w:pPr>
+      <w:r>
+        <w:rPr>
+          <w:b/>
+          <w:bCs/>
+          <w:color w:val="1565C0"/>
+          <w:sz w:val="24"/>
+          <w:szCs w:val="24"/>
+        </w:rPr>
+        <w:t xml:space="preserve">ui-ux</w:t>
+      </w:r>
+    </w:p>
+    <w:p>
+      <w:pPr>
+        <w:spacing w:before="120" w:after="60"/>
+        <w:jc w:val="center"/>
+      </w:pPr>
+      <w:r>
+        <w:drawing>
+          <wp:inline distT="0" distB="0" distL="0" distR="0">
+            <wp:extent cx="5715000" cy="3619500"/>
+            <wp:effectExtent t="0" r="0" b="0" l="0"/>
+            <wp:docPr id="1" name="" descr="" title=""/>
+            <wp:cNvGraphicFramePr>
+              <a:graphicFrameLocks xmlns:a="http://schemas.openxmlformats.org/drawingml/2006/main" noChangeAspect="1"/>
+            </wp:cNvGraphicFramePr>
+            <a:graphic xmlns:a="http://schemas.openxmlformats.org/drawingml/2006/main">
+              <a:graphicData uri="http://schemas.openxmlformats.org/drawingml/2006/picture">
+                <pic:pic xmlns:pic="http://schemas.openxmlformats.org/drawingml/2006/picture">
+                  <pic:nvPicPr>
+                    <pic:cNvPr id="0" name="" descr=""/>
+                    <pic:cNvPicPr>
+                      <a:picLocks noChangeAspect="1" noChangeArrowheads="1"/>
+                    </pic:cNvPicPr>
+                  </pic:nvPicPr>
+                  <pic:blipFill>
+                    <a:blip r:embed="rId21" cstate="none"/>
                     <a:srcRect/>
                     <a:stretch>
                       <a:fillRect/>

</xml_diff>